<commit_message>
feat(cadrage+admin): refresh framing doc + admin en mode light
- Document de cadrage mis à jour : chatbot remonté de Could have vers
  Must have (persistance BDD + console admin exigées par CDC §XV),
  modèle de données passé à 17 modèles (ajout ChatbotConversation +
  ChatbotMessage), Tiptap mentionné dans la stack UI pour l'éditeur
  riche du carrousel. Layout typographique resserré (marges 2cm,
  interligne 1.15) pour un rendu académique propre.
- Document regénéré en PDF (38 pages A4) et Word (TOC cliquable profondeur 3).
- Admin layout repasse en thème light pour cohérence avec la page
  d'accueil publique (retrait de className="dark" forcé).
</commit_message>
<xml_diff>
--- a/docs/DOCUMENT_CADRAGE.docx
+++ b/docs/DOCUMENT_CADRAGE.docx
@@ -77,7 +77,7 @@
         <w:p>
           <w:r>
             <w:fldChar w:fldCharType="begin" w:dirty="true"/>
-            <w:instrText xml:space="preserve">TOC \o "1-2" \h \z \u</w:instrText>
+            <w:instrText xml:space="preserve">TOC \o "1-3" \h \z \u</w:instrText>
             <w:fldChar w:fldCharType="separate"/>
             <w:fldChar w:fldCharType="end"/>
           </w:r>
@@ -1721,6 +1721,30 @@
           </w:p>
         </w:tc>
       </w:tr>
+      <w:tr>
+        <w:tc>
+          <w:tcPr/>
+          <w:p>
+            <w:pPr>
+              <w:pStyle w:val="Compact"/>
+            </w:pPr>
+            <w:r>
+              <w:t xml:space="preserve">Chatbot avec persistance des conversations en base</w:t>
+            </w:r>
+          </w:p>
+        </w:tc>
+        <w:tc>
+          <w:tcPr/>
+          <w:p>
+            <w:pPr>
+              <w:pStyle w:val="Compact"/>
+            </w:pPr>
+            <w:r>
+              <w:t xml:space="preserve">Support utilisateur + traçabilité exigée par le CDC §XV</w:t>
+            </w:r>
+          </w:p>
+        </w:tc>
+      </w:tr>
     </w:tbl>
     <w:bookmarkEnd w:id="20"/>
     <w:bookmarkStart w:id="21" w:name="should-have-fortement-attendu"/>
@@ -1774,7 +1798,7 @@
         </w:numPr>
       </w:pPr>
       <w:r>
-        <w:t xml:space="preserve">Recherche rapide à facettes.</w:t>
+        <w:t xml:space="preserve">Recherche rapide à facettes (titre, description, caractéristiques techniques, prix, catégorie, disponibilité).</w:t>
       </w:r>
     </w:p>
     <w:p>
@@ -1822,7 +1846,7 @@
         </w:numPr>
       </w:pPr>
       <w:r>
-        <w:t xml:space="preserve">Carrousel d’accueil éditable par les administrateurs.</w:t>
+        <w:t xml:space="preserve">Carrousel d’accueil éditable avec éditeur de texte riche (gras, italique, liens, couleurs).</w:t>
       </w:r>
     </w:p>
     <w:bookmarkEnd w:id="21"/>
@@ -1842,18 +1866,6 @@
       </w:r>
       <w:r>
         <w:t xml:space="preserve">Could have — nice to have</w:t>
-      </w:r>
-    </w:p>
-    <w:p>
-      <w:pPr>
-        <w:pStyle w:val="Compact"/>
-        <w:numPr>
-          <w:ilvl w:val="0"/>
-          <w:numId w:val="1007"/>
-        </w:numPr>
-      </w:pPr>
-      <w:r>
-        <w:t xml:space="preserve">Chatbot conversationnel pour le support de premier niveau.</w:t>
       </w:r>
     </w:p>
     <w:p>
@@ -3349,7 +3361,7 @@
       </w:r>
     </w:p>
     <w:bookmarkEnd w:id="42"/>
-    <w:bookmarkStart w:id="43" w:name="X3b3f8f4afad5dae470cb29da1cffbe60e2bc410"/>
+    <w:bookmarkStart w:id="43" w:name="X3185aaa3bfba713fd48778b9e396529f0cd8128"/>
     <w:p>
       <w:pPr>
         <w:pStyle w:val="Heading2"/>
@@ -3364,7 +3376,7 @@
         <w:tab/>
       </w:r>
       <w:r>
-        <w:t xml:space="preserve">Interface utilisateur — Tailwind CSS et shadcn/ui</w:t>
+        <w:t xml:space="preserve">Interface utilisateur — Tailwind CSS, shadcn/ui et Tiptap</w:t>
       </w:r>
     </w:p>
     <w:p>
@@ -3399,6 +3411,22 @@
       </w:r>
       <w:r>
         <w:t xml:space="preserve">est une collection de composants graphiques (boutons, menus, tableaux) déjà pensés pour être accessibles (compatibles WCAG). Ce duo permet de livrer une interface à la fois moderne, cohérente et conforme aux normes d’accessibilité sans repartir de zéro.</w:t>
+      </w:r>
+      <w:r>
+        <w:t xml:space="preserve"> </w:t>
+      </w:r>
+      <w:r>
+        <w:rPr>
+          <w:b/>
+          <w:bCs/>
+        </w:rPr>
+        <w:t xml:space="preserve">Tiptap</w:t>
+      </w:r>
+      <w:r>
+        <w:t xml:space="preserve"> </w:t>
+      </w:r>
+      <w:r>
+        <w:t xml:space="preserve">est ajouté pour l’éditeur de texte riche requis par le cahier des charges dans l’administration (carrousel de la page d’accueil), avec prise en charge de la mise en forme (gras, italique, liens, couleurs).</w:t>
       </w:r>
     </w:p>
     <w:bookmarkEnd w:id="43"/>
@@ -3775,7 +3803,7 @@
               <w:pStyle w:val="Compact"/>
             </w:pPr>
             <w:r>
-              <w:t xml:space="preserve">Tailwind CSS + shadcn/ui</w:t>
+              <w:t xml:space="preserve">Tailwind CSS + shadcn/ui + Tiptap (éditeur riche admin)</w:t>
             </w:r>
           </w:p>
         </w:tc>
@@ -3933,7 +3961,23 @@
         <w:t xml:space="preserve">six grands domaines</w:t>
       </w:r>
       <w:r>
-        <w:t xml:space="preserve">, eux-mêmes composés d’entités reliées entre elles :</w:t>
+        <w:t xml:space="preserve">, eux-mêmes composés d’entités reliées entre elles. Elle comporte</w:t>
+      </w:r>
+      <w:r>
+        <w:t xml:space="preserve"> </w:t>
+      </w:r>
+      <w:r>
+        <w:rPr>
+          <w:b/>
+          <w:bCs/>
+        </w:rPr>
+        <w:t xml:space="preserve">dix-sept modèles</w:t>
+      </w:r>
+      <w:r>
+        <w:t xml:space="preserve"> </w:t>
+      </w:r>
+      <w:r>
+        <w:t xml:space="preserve">et sept énumérations.</w:t>
       </w:r>
     </w:p>
     <w:p>
@@ -4043,7 +4087,7 @@
         <w:t xml:space="preserve"> </w:t>
       </w:r>
       <w:r>
-        <w:t xml:space="preserve">: les messages issus du formulaire de contact et du chatbot.</w:t>
+        <w:t xml:space="preserve">: les messages issus du formulaire de contact, ainsi que les conversations du chatbot (deux modèles dédiés : une conversation + ses messages) pour assurer la traçabilité et le suivi par les administrateurs, conformément au CDC §XV.</w:t>
       </w:r>
     </w:p>
     <w:bookmarkEnd w:id="50"/>

</xml_diff>